<commit_message>
chinh lai Approve Supplier
</commit_message>
<xml_diff>
--- a/Document/Uoc tinh khoi luong cv hoan thanh.docx
+++ b/Document/Uoc tinh khoi luong cv hoan thanh.docx
@@ -7,182 +7,72 @@
         <w:pStyle w:val="Title"/>
         <w:jc w:val="center"/>
         <w:rPr>
-          <w:sz w:val="36"/>
-        </w:rPr>
-      </w:pPr>
-      <w:r>
-        <w:rPr>
-          <w:sz w:val="36"/>
-        </w:rPr>
-        <w:t>Estimate the amount of work to be completed</w:t>
+          <w:sz w:val="34"/>
+        </w:rPr>
+      </w:pPr>
+      <w:r>
+        <w:rPr>
+          <w:sz w:val="34"/>
+        </w:rPr>
+        <w:t xml:space="preserve">KHỐI LƯỢNG CÔNG VIỆC ĐÃ HOÀN THÀNH </w:t>
+      </w:r>
+      <w:r>
+        <w:rPr>
+          <w:sz w:val="34"/>
+        </w:rPr>
+        <w:t>TRONG THÁNG</w:t>
       </w:r>
     </w:p>
     <w:p>
       <w:pPr>
+        <w:pStyle w:val="Title"/>
         <w:jc w:val="center"/>
         <w:rPr>
-          <w:sz w:val="30"/>
-        </w:rPr>
-      </w:pPr>
-      <w:r>
-        <w:rPr>
-          <w:sz w:val="30"/>
-        </w:rPr>
-        <w:t>In 02/2026</w:t>
-      </w:r>
-    </w:p>
-    <w:p/>
-    <w:p>
-      <w:pPr>
-        <w:pStyle w:val="Heading1"/>
-        <w:numPr>
-          <w:ilvl w:val="0"/>
-          <w:numId w:val="4"/>
-        </w:numPr>
-      </w:pPr>
-      <w:r>
-        <w:t xml:space="preserve">CHI TIẾT ĐÁNH GIÁ </w:t>
+          <w:color w:val="7030A0"/>
+          <w:sz w:val="36"/>
+        </w:rPr>
+      </w:pPr>
+      <w:r>
+        <w:rPr>
+          <w:color w:val="7030A0"/>
+          <w:sz w:val="36"/>
+        </w:rPr>
+        <w:t>WORK COMPL</w:t>
+      </w:r>
+      <w:r>
+        <w:rPr>
+          <w:color w:val="7030A0"/>
+          <w:sz w:val="36"/>
+        </w:rPr>
+        <w:t>E</w:t>
+      </w:r>
+      <w:r>
+        <w:rPr>
+          <w:color w:val="7030A0"/>
+          <w:sz w:val="36"/>
+        </w:rPr>
+        <w:t xml:space="preserve">TED  </w:t>
+      </w:r>
+      <w:r>
+        <w:rPr>
+          <w:color w:val="7030A0"/>
+          <w:sz w:val="36"/>
+        </w:rPr>
+        <w:t>IN MONTH</w:t>
       </w:r>
     </w:p>
     <w:p>
       <w:pPr>
-        <w:pStyle w:val="NoSpacing"/>
-        <w:numPr>
-          <w:ilvl w:val="0"/>
-          <w:numId w:val="14"/>
-        </w:numPr>
-        <w:rPr>
-          <w:szCs w:val="24"/>
-        </w:rPr>
-      </w:pPr>
-      <w:r>
-        <w:rPr>
-          <w:szCs w:val="24"/>
-        </w:rPr>
-        <w:t>Đọc hiểu tài liệu mô tả tổng quát hệ thống</w:t>
-      </w:r>
-    </w:p>
-    <w:p>
-      <w:pPr>
-        <w:pStyle w:val="NoSpacing"/>
-        <w:numPr>
-          <w:ilvl w:val="0"/>
-          <w:numId w:val="14"/>
-        </w:numPr>
-        <w:rPr>
-          <w:szCs w:val="24"/>
-        </w:rPr>
-      </w:pPr>
-      <w:r>
-        <w:rPr>
-          <w:szCs w:val="24"/>
-        </w:rPr>
-        <w:t>Hai bên thống nhất kiến trúc chính của chương trình, phương thức trao đổi, quản lý code cà các quy định chung khác .</w:t>
-      </w:r>
-    </w:p>
-    <w:p>
-      <w:pPr>
-        <w:pStyle w:val="NoSpacing"/>
-        <w:numPr>
-          <w:ilvl w:val="0"/>
-          <w:numId w:val="14"/>
-        </w:numPr>
-        <w:rPr>
-          <w:szCs w:val="24"/>
-        </w:rPr>
-      </w:pPr>
-      <w:r>
-        <w:rPr>
-          <w:szCs w:val="24"/>
-        </w:rPr>
-        <w:t>Thực hiện code page Danh sách Nhà Cung cấp, Page Chi tiết nhà cung cấp</w:t>
-      </w:r>
-      <w:r>
-        <w:rPr>
-          <w:szCs w:val="24"/>
-        </w:rPr>
-        <w:t>.</w:t>
-      </w:r>
-    </w:p>
-    <w:p>
-      <w:pPr>
-        <w:pStyle w:val="NoSpacing"/>
-        <w:numPr>
-          <w:ilvl w:val="0"/>
-          <w:numId w:val="14"/>
-        </w:numPr>
-        <w:rPr>
-          <w:szCs w:val="24"/>
-        </w:rPr>
-      </w:pPr>
-      <w:r>
-        <w:rPr>
-          <w:szCs w:val="24"/>
-        </w:rPr>
-        <w:t xml:space="preserve">Đánh giá mức độ hoàn thành công việc được gia trong tháng là 60% </w:t>
-      </w:r>
-    </w:p>
-    <w:p>
-      <w:pPr>
-        <w:pStyle w:val="NoSpacing"/>
-        <w:numPr>
-          <w:ilvl w:val="0"/>
-          <w:numId w:val="14"/>
-        </w:numPr>
-        <w:rPr>
-          <w:szCs w:val="24"/>
-        </w:rPr>
-      </w:pPr>
-      <w:r>
-        <w:rPr>
-          <w:szCs w:val="24"/>
-        </w:rPr>
-        <w:t>Chi phí sẽ trả cho tháng 2/2026(tháng thứ nhất của hợp đồng ) sẽ là 60% của 20 triệu VND</w:t>
-      </w:r>
-    </w:p>
-    <w:p>
-      <w:pPr>
-        <w:pStyle w:val="NoSpacing"/>
-        <w:ind w:left="720"/>
-        <w:rPr>
-          <w:szCs w:val="24"/>
-        </w:rPr>
-      </w:pPr>
-      <w:r>
-        <w:rPr>
-          <w:szCs w:val="24"/>
-        </w:rPr>
-        <w:t xml:space="preserve">= 20,000,000/100*60 = </w:t>
-      </w:r>
-      <w:r>
-        <w:rPr>
-          <w:szCs w:val="24"/>
-        </w:rPr>
-        <w:t>12,000,000(Mười hai triệu Việt Nam Đồng)</w:t>
-      </w:r>
-    </w:p>
-    <w:p>
-      <w:pPr>
-        <w:pStyle w:val="NoSpacing"/>
-        <w:ind w:left="720"/>
-        <w:rPr>
-          <w:szCs w:val="24"/>
-        </w:rPr>
-      </w:pPr>
-    </w:p>
-    <w:p>
-      <w:pPr>
-        <w:pStyle w:val="NoSpacing"/>
-        <w:ind w:left="720"/>
-        <w:rPr>
-          <w:szCs w:val="24"/>
-        </w:rPr>
-      </w:pPr>
-      <w:r>
-        <w:rPr>
-          <w:szCs w:val="24"/>
-        </w:rPr>
-        <w:t>Người đánh giá</w:t>
+        <w:jc w:val="center"/>
+        <w:rPr>
+          <w:sz w:val="30"/>
+        </w:rPr>
+      </w:pPr>
+      <w:r>
+        <w:rPr>
+          <w:sz w:val="30"/>
+        </w:rPr>
+        <w:t>2/2026</w:t>
       </w:r>
       <w:bookmarkStart w:id="0" w:name="_GoBack"/>
       <w:bookmarkEnd w:id="0"/>
@@ -190,25 +80,869 @@
     <w:p>
       <w:pPr>
         <w:pStyle w:val="NoSpacing"/>
-        <w:ind w:left="720"/>
-        <w:rPr>
-          <w:szCs w:val="24"/>
-        </w:rPr>
-      </w:pPr>
+        <w:numPr>
+          <w:ilvl w:val="0"/>
+          <w:numId w:val="15"/>
+        </w:numPr>
+        <w:rPr>
+          <w:i/>
+          <w:color w:val="7030A0"/>
+          <w:szCs w:val="24"/>
+        </w:rPr>
+      </w:pPr>
+      <w:r>
+        <w:rPr>
+          <w:szCs w:val="24"/>
+        </w:rPr>
+        <w:t xml:space="preserve">Căn cứ theo </w:t>
+      </w:r>
+      <w:r>
+        <w:rPr>
+          <w:szCs w:val="24"/>
+        </w:rPr>
+        <w:t>H</w:t>
+      </w:r>
+      <w:r>
+        <w:rPr>
+          <w:szCs w:val="24"/>
+        </w:rPr>
+        <w:t xml:space="preserve">ợp </w:t>
+      </w:r>
+      <w:r>
+        <w:rPr>
+          <w:szCs w:val="24"/>
+        </w:rPr>
+        <w:t>Đ</w:t>
+      </w:r>
+      <w:r>
+        <w:rPr>
+          <w:szCs w:val="24"/>
+        </w:rPr>
+        <w:t xml:space="preserve">ồng </w:t>
+      </w:r>
+      <w:r>
+        <w:rPr>
+          <w:szCs w:val="24"/>
+        </w:rPr>
+        <w:t xml:space="preserve">phát triển </w:t>
+      </w:r>
+      <w:r>
+        <w:rPr>
+          <w:szCs w:val="24"/>
+        </w:rPr>
+        <w:t>phần mềm số : 01/2026/HĐ-PM</w:t>
+      </w:r>
+      <w:r>
+        <w:rPr>
+          <w:szCs w:val="24"/>
+        </w:rPr>
+        <w:t>, ký ngày 05/02/2026.</w:t>
+      </w:r>
+      <w:r>
+        <w:rPr>
+          <w:szCs w:val="24"/>
+        </w:rPr>
+        <w:br/>
+      </w:r>
+      <w:r>
+        <w:rPr>
+          <w:szCs w:val="24"/>
+        </w:rPr>
+        <w:t xml:space="preserve"> </w:t>
+      </w:r>
+      <w:r>
+        <w:rPr>
+          <w:szCs w:val="24"/>
+        </w:rPr>
+        <w:t>Tổng khối lượng công việc được giao</w:t>
+      </w:r>
+      <w:r>
+        <w:rPr>
+          <w:szCs w:val="24"/>
+        </w:rPr>
+        <w:t xml:space="preserve"> theo hợp đồng</w:t>
+      </w:r>
+      <w:r>
+        <w:rPr>
+          <w:szCs w:val="24"/>
+        </w:rPr>
+        <w:t>: Toàn bộ Modul</w:t>
+      </w:r>
+      <w:r>
+        <w:rPr>
+          <w:szCs w:val="24"/>
+        </w:rPr>
+        <w:t>e</w:t>
+      </w:r>
+      <w:r>
+        <w:rPr>
+          <w:szCs w:val="24"/>
+        </w:rPr>
+        <w:t xml:space="preserve"> Purchasing</w:t>
+      </w:r>
+      <w:r>
+        <w:rPr>
+          <w:szCs w:val="24"/>
+        </w:rPr>
+        <w:br/>
+      </w:r>
+      <w:r>
+        <w:rPr>
+          <w:i/>
+          <w:color w:val="7030A0"/>
+          <w:szCs w:val="24"/>
+        </w:rPr>
+        <w:t>Based on software development contract number: 01/2026/HĐ-PM, signed on February 5, 2026.Total scope of work assigned under the contract: The entire Purchasing Module</w:t>
+      </w:r>
     </w:p>
     <w:p>
       <w:pPr>
         <w:pStyle w:val="NoSpacing"/>
-        <w:ind w:left="720"/>
-        <w:rPr>
-          <w:szCs w:val="24"/>
-        </w:rPr>
-      </w:pPr>
-      <w:r>
-        <w:rPr>
-          <w:szCs w:val="24"/>
-        </w:rPr>
-        <w:t>Đặng Quang Hải</w:t>
+        <w:numPr>
+          <w:ilvl w:val="0"/>
+          <w:numId w:val="15"/>
+        </w:numPr>
+        <w:rPr>
+          <w:szCs w:val="24"/>
+        </w:rPr>
+      </w:pPr>
+      <w:r>
+        <w:rPr>
+          <w:szCs w:val="24"/>
+        </w:rPr>
+        <w:t>T</w:t>
+      </w:r>
+      <w:r>
+        <w:rPr>
+          <w:szCs w:val="24"/>
+        </w:rPr>
+        <w:t>ổ</w:t>
+      </w:r>
+      <w:r>
+        <w:rPr>
+          <w:szCs w:val="24"/>
+        </w:rPr>
+        <w:t>ng khối lượng giao trong tháng 2/2026</w:t>
+      </w:r>
+      <w:r>
+        <w:rPr>
+          <w:szCs w:val="24"/>
+        </w:rPr>
+        <w:t xml:space="preserve"> là 4 task có trọng số (Weight)</w:t>
+      </w:r>
+      <w:r>
+        <w:rPr>
+          <w:szCs w:val="24"/>
+        </w:rPr>
+        <w:t>: được chia làm 10 phần</w:t>
+      </w:r>
+      <w:r>
+        <w:rPr>
+          <w:szCs w:val="24"/>
+        </w:rPr>
+        <w:br/>
+      </w:r>
+      <w:r>
+        <w:rPr>
+          <w:i/>
+          <w:color w:val="7030A0"/>
+          <w:szCs w:val="24"/>
+        </w:rPr>
+        <w:t>The total volume of deliveries in February 2026 consists of 4 weighted tasks, divided into 10 parts.</w:t>
+      </w:r>
+    </w:p>
+    <w:tbl>
+      <w:tblPr>
+        <w:tblStyle w:val="TableGrid"/>
+        <w:tblW w:w="0" w:type="auto"/>
+        <w:tblInd w:w="720" w:type="dxa"/>
+        <w:tblLook w:val="04A0" w:firstRow="1" w:lastRow="0" w:firstColumn="1" w:lastColumn="0" w:noHBand="0" w:noVBand="1"/>
+      </w:tblPr>
+      <w:tblGrid>
+        <w:gridCol w:w="976"/>
+        <w:gridCol w:w="4111"/>
+        <w:gridCol w:w="1701"/>
+        <w:gridCol w:w="1418"/>
+      </w:tblGrid>
+      <w:tr>
+        <w:tc>
+          <w:tcPr>
+            <w:tcW w:w="976" w:type="dxa"/>
+          </w:tcPr>
+          <w:p>
+            <w:pPr>
+              <w:pStyle w:val="NoSpacing"/>
+              <w:rPr>
+                <w:szCs w:val="24"/>
+              </w:rPr>
+            </w:pPr>
+            <w:r>
+              <w:rPr>
+                <w:szCs w:val="24"/>
+              </w:rPr>
+              <w:t xml:space="preserve">Thứ tự/ </w:t>
+            </w:r>
+            <w:r>
+              <w:rPr>
+                <w:i/>
+                <w:color w:val="7030A0"/>
+                <w:szCs w:val="24"/>
+              </w:rPr>
+              <w:t>Order</w:t>
+            </w:r>
+          </w:p>
+        </w:tc>
+        <w:tc>
+          <w:tcPr>
+            <w:tcW w:w="4111" w:type="dxa"/>
+          </w:tcPr>
+          <w:p>
+            <w:pPr>
+              <w:pStyle w:val="NoSpacing"/>
+              <w:rPr>
+                <w:szCs w:val="24"/>
+              </w:rPr>
+            </w:pPr>
+            <w:r>
+              <w:rPr>
+                <w:szCs w:val="24"/>
+              </w:rPr>
+              <w:t xml:space="preserve">Mô tả/ </w:t>
+            </w:r>
+            <w:r>
+              <w:rPr>
+                <w:i/>
+                <w:color w:val="7030A0"/>
+                <w:szCs w:val="24"/>
+              </w:rPr>
+              <w:t>Description</w:t>
+            </w:r>
+          </w:p>
+        </w:tc>
+        <w:tc>
+          <w:tcPr>
+            <w:tcW w:w="1701" w:type="dxa"/>
+          </w:tcPr>
+          <w:p>
+            <w:pPr>
+              <w:pStyle w:val="NoSpacing"/>
+              <w:rPr>
+                <w:szCs w:val="24"/>
+              </w:rPr>
+            </w:pPr>
+            <w:r>
+              <w:t>Trọng số /</w:t>
+            </w:r>
+            <w:r>
+              <w:rPr>
+                <w:color w:val="7030A0"/>
+              </w:rPr>
+              <w:t>Weight</w:t>
+            </w:r>
+          </w:p>
+        </w:tc>
+        <w:tc>
+          <w:tcPr>
+            <w:tcW w:w="1418" w:type="dxa"/>
+          </w:tcPr>
+          <w:p>
+            <w:pPr>
+              <w:pStyle w:val="NoSpacing"/>
+              <w:rPr>
+                <w:szCs w:val="24"/>
+              </w:rPr>
+            </w:pPr>
+            <w:r>
+              <w:rPr>
+                <w:szCs w:val="24"/>
+              </w:rPr>
+              <w:t>Tỷ lệ hoàn thành/</w:t>
+            </w:r>
+            <w:r>
+              <w:rPr>
+                <w:szCs w:val="24"/>
+              </w:rPr>
+              <w:br/>
+            </w:r>
+            <w:r>
+              <w:rPr>
+                <w:color w:val="7030A0"/>
+                <w:szCs w:val="24"/>
+              </w:rPr>
+              <w:t>% Complete</w:t>
+            </w:r>
+          </w:p>
+        </w:tc>
+      </w:tr>
+      <w:tr>
+        <w:tc>
+          <w:tcPr>
+            <w:tcW w:w="976" w:type="dxa"/>
+          </w:tcPr>
+          <w:p>
+            <w:pPr>
+              <w:pStyle w:val="NoSpacing"/>
+              <w:rPr>
+                <w:szCs w:val="24"/>
+              </w:rPr>
+            </w:pPr>
+            <w:r>
+              <w:rPr>
+                <w:szCs w:val="24"/>
+              </w:rPr>
+              <w:t>1</w:t>
+            </w:r>
+          </w:p>
+        </w:tc>
+        <w:tc>
+          <w:tcPr>
+            <w:tcW w:w="4111" w:type="dxa"/>
+          </w:tcPr>
+          <w:p>
+            <w:pPr>
+              <w:pStyle w:val="NoSpacing"/>
+              <w:rPr>
+                <w:szCs w:val="24"/>
+              </w:rPr>
+            </w:pPr>
+            <w:r>
+              <w:rPr>
+                <w:szCs w:val="24"/>
+              </w:rPr>
+              <w:t xml:space="preserve">Đọc hiểu tài liệu chung/ </w:t>
+            </w:r>
+            <w:r>
+              <w:rPr>
+                <w:color w:val="7030A0"/>
+                <w:szCs w:val="24"/>
+              </w:rPr>
+              <w:t>Studing General Document</w:t>
+            </w:r>
+          </w:p>
+        </w:tc>
+        <w:tc>
+          <w:tcPr>
+            <w:tcW w:w="1701" w:type="dxa"/>
+          </w:tcPr>
+          <w:p>
+            <w:pPr>
+              <w:pStyle w:val="NoSpacing"/>
+              <w:rPr>
+                <w:szCs w:val="24"/>
+              </w:rPr>
+            </w:pPr>
+            <w:r>
+              <w:rPr>
+                <w:szCs w:val="24"/>
+              </w:rPr>
+              <w:t>5</w:t>
+            </w:r>
+            <w:r>
+              <w:rPr>
+                <w:szCs w:val="24"/>
+              </w:rPr>
+              <w:t>/10</w:t>
+            </w:r>
+            <w:r>
+              <w:rPr>
+                <w:szCs w:val="24"/>
+              </w:rPr>
+              <w:t xml:space="preserve"> </w:t>
+            </w:r>
+          </w:p>
+        </w:tc>
+        <w:tc>
+          <w:tcPr>
+            <w:tcW w:w="1418" w:type="dxa"/>
+          </w:tcPr>
+          <w:p>
+            <w:pPr>
+              <w:pStyle w:val="NoSpacing"/>
+              <w:rPr>
+                <w:szCs w:val="24"/>
+              </w:rPr>
+            </w:pPr>
+            <w:r>
+              <w:rPr>
+                <w:szCs w:val="24"/>
+              </w:rPr>
+              <w:t>100%</w:t>
+            </w:r>
+          </w:p>
+        </w:tc>
+      </w:tr>
+      <w:tr>
+        <w:tc>
+          <w:tcPr>
+            <w:tcW w:w="976" w:type="dxa"/>
+          </w:tcPr>
+          <w:p>
+            <w:pPr>
+              <w:pStyle w:val="NoSpacing"/>
+              <w:rPr>
+                <w:szCs w:val="24"/>
+              </w:rPr>
+            </w:pPr>
+            <w:r>
+              <w:rPr>
+                <w:szCs w:val="24"/>
+              </w:rPr>
+              <w:t>2</w:t>
+            </w:r>
+          </w:p>
+        </w:tc>
+        <w:tc>
+          <w:tcPr>
+            <w:tcW w:w="4111" w:type="dxa"/>
+          </w:tcPr>
+          <w:p>
+            <w:pPr>
+              <w:pStyle w:val="NoSpacing"/>
+              <w:rPr>
+                <w:szCs w:val="24"/>
+              </w:rPr>
+            </w:pPr>
+            <w:r>
+              <w:rPr>
+                <w:szCs w:val="24"/>
+              </w:rPr>
+              <w:t xml:space="preserve">Viết </w:t>
+            </w:r>
+            <w:r>
+              <w:rPr>
+                <w:szCs w:val="24"/>
+              </w:rPr>
+              <w:t>mã</w:t>
+            </w:r>
+            <w:r>
+              <w:rPr>
+                <w:szCs w:val="24"/>
+              </w:rPr>
+              <w:t xml:space="preserve"> quản lý danh sách nhà cung cấp/ </w:t>
+            </w:r>
+            <w:r>
+              <w:rPr>
+                <w:color w:val="7030A0"/>
+                <w:szCs w:val="24"/>
+              </w:rPr>
+              <w:t>Code Supplier List</w:t>
+            </w:r>
+          </w:p>
+        </w:tc>
+        <w:tc>
+          <w:tcPr>
+            <w:tcW w:w="1701" w:type="dxa"/>
+          </w:tcPr>
+          <w:p>
+            <w:pPr>
+              <w:pStyle w:val="NoSpacing"/>
+              <w:rPr>
+                <w:szCs w:val="24"/>
+              </w:rPr>
+            </w:pPr>
+            <w:r>
+              <w:rPr>
+                <w:szCs w:val="24"/>
+              </w:rPr>
+              <w:t>0.5</w:t>
+            </w:r>
+            <w:r>
+              <w:rPr>
+                <w:szCs w:val="24"/>
+              </w:rPr>
+              <w:t>/10</w:t>
+            </w:r>
+            <w:r>
+              <w:rPr>
+                <w:szCs w:val="24"/>
+              </w:rPr>
+              <w:t xml:space="preserve"> </w:t>
+            </w:r>
+          </w:p>
+        </w:tc>
+        <w:tc>
+          <w:tcPr>
+            <w:tcW w:w="1418" w:type="dxa"/>
+          </w:tcPr>
+          <w:p>
+            <w:pPr>
+              <w:pStyle w:val="NoSpacing"/>
+              <w:rPr>
+                <w:szCs w:val="24"/>
+              </w:rPr>
+            </w:pPr>
+            <w:r>
+              <w:rPr>
+                <w:szCs w:val="24"/>
+              </w:rPr>
+              <w:t>5</w:t>
+            </w:r>
+            <w:r>
+              <w:rPr>
+                <w:szCs w:val="24"/>
+              </w:rPr>
+              <w:t>0%</w:t>
+            </w:r>
+          </w:p>
+        </w:tc>
+      </w:tr>
+      <w:tr>
+        <w:tc>
+          <w:tcPr>
+            <w:tcW w:w="976" w:type="dxa"/>
+          </w:tcPr>
+          <w:p>
+            <w:pPr>
+              <w:pStyle w:val="NoSpacing"/>
+              <w:rPr>
+                <w:szCs w:val="24"/>
+              </w:rPr>
+            </w:pPr>
+            <w:r>
+              <w:rPr>
+                <w:szCs w:val="24"/>
+              </w:rPr>
+              <w:t>3</w:t>
+            </w:r>
+          </w:p>
+        </w:tc>
+        <w:tc>
+          <w:tcPr>
+            <w:tcW w:w="4111" w:type="dxa"/>
+          </w:tcPr>
+          <w:p>
+            <w:pPr>
+              <w:pStyle w:val="NoSpacing"/>
+              <w:rPr>
+                <w:szCs w:val="24"/>
+              </w:rPr>
+            </w:pPr>
+            <w:r>
+              <w:rPr>
+                <w:szCs w:val="24"/>
+              </w:rPr>
+              <w:t xml:space="preserve">Viết mã </w:t>
+            </w:r>
+            <w:r>
+              <w:rPr>
+                <w:szCs w:val="24"/>
+              </w:rPr>
+              <w:t xml:space="preserve">quản lý yêu cầu cung cấp hành hóa/ </w:t>
+            </w:r>
+            <w:r>
+              <w:rPr>
+                <w:color w:val="7030A0"/>
+                <w:szCs w:val="24"/>
+              </w:rPr>
+              <w:t>Code  Materital Request</w:t>
+            </w:r>
+          </w:p>
+        </w:tc>
+        <w:tc>
+          <w:tcPr>
+            <w:tcW w:w="1701" w:type="dxa"/>
+          </w:tcPr>
+          <w:p>
+            <w:pPr>
+              <w:pStyle w:val="NoSpacing"/>
+              <w:rPr>
+                <w:szCs w:val="24"/>
+              </w:rPr>
+            </w:pPr>
+            <w:r>
+              <w:rPr>
+                <w:szCs w:val="24"/>
+              </w:rPr>
+              <w:t>2.5</w:t>
+            </w:r>
+            <w:r>
+              <w:rPr>
+                <w:szCs w:val="24"/>
+              </w:rPr>
+              <w:t>/10</w:t>
+            </w:r>
+            <w:r>
+              <w:rPr>
+                <w:szCs w:val="24"/>
+              </w:rPr>
+              <w:t xml:space="preserve"> </w:t>
+            </w:r>
+          </w:p>
+        </w:tc>
+        <w:tc>
+          <w:tcPr>
+            <w:tcW w:w="1418" w:type="dxa"/>
+          </w:tcPr>
+          <w:p>
+            <w:pPr>
+              <w:pStyle w:val="NoSpacing"/>
+              <w:rPr>
+                <w:szCs w:val="24"/>
+              </w:rPr>
+            </w:pPr>
+            <w:r>
+              <w:rPr>
+                <w:szCs w:val="24"/>
+              </w:rPr>
+              <w:t>17</w:t>
+            </w:r>
+            <w:r>
+              <w:rPr>
+                <w:szCs w:val="24"/>
+              </w:rPr>
+              <w:t>%</w:t>
+            </w:r>
+          </w:p>
+        </w:tc>
+      </w:tr>
+      <w:tr>
+        <w:tc>
+          <w:tcPr>
+            <w:tcW w:w="976" w:type="dxa"/>
+          </w:tcPr>
+          <w:p>
+            <w:pPr>
+              <w:pStyle w:val="NoSpacing"/>
+              <w:rPr>
+                <w:szCs w:val="24"/>
+              </w:rPr>
+            </w:pPr>
+            <w:r>
+              <w:rPr>
+                <w:szCs w:val="24"/>
+              </w:rPr>
+              <w:t>4</w:t>
+            </w:r>
+          </w:p>
+        </w:tc>
+        <w:tc>
+          <w:tcPr>
+            <w:tcW w:w="4111" w:type="dxa"/>
+          </w:tcPr>
+          <w:p>
+            <w:pPr>
+              <w:pStyle w:val="NoSpacing"/>
+              <w:rPr>
+                <w:szCs w:val="24"/>
+              </w:rPr>
+            </w:pPr>
+            <w:r>
+              <w:rPr>
+                <w:szCs w:val="24"/>
+              </w:rPr>
+              <w:t xml:space="preserve">Viết mã </w:t>
+            </w:r>
+            <w:r>
+              <w:rPr>
+                <w:szCs w:val="24"/>
+              </w:rPr>
+              <w:t xml:space="preserve"> quản lý công tác phê duyệt nhà cung cấp/ </w:t>
+            </w:r>
+            <w:r>
+              <w:rPr>
+                <w:color w:val="7030A0"/>
+                <w:szCs w:val="24"/>
+              </w:rPr>
+              <w:t>Code Approve Supplier</w:t>
+            </w:r>
+          </w:p>
+        </w:tc>
+        <w:tc>
+          <w:tcPr>
+            <w:tcW w:w="1701" w:type="dxa"/>
+          </w:tcPr>
+          <w:p>
+            <w:pPr>
+              <w:pStyle w:val="NoSpacing"/>
+              <w:rPr>
+                <w:szCs w:val="24"/>
+              </w:rPr>
+            </w:pPr>
+            <w:r>
+              <w:rPr>
+                <w:szCs w:val="24"/>
+              </w:rPr>
+              <w:t>2</w:t>
+            </w:r>
+            <w:r>
+              <w:rPr>
+                <w:szCs w:val="24"/>
+              </w:rPr>
+              <w:t>/10</w:t>
+            </w:r>
+            <w:r>
+              <w:rPr>
+                <w:szCs w:val="24"/>
+              </w:rPr>
+              <w:t xml:space="preserve"> </w:t>
+            </w:r>
+          </w:p>
+        </w:tc>
+        <w:tc>
+          <w:tcPr>
+            <w:tcW w:w="1418" w:type="dxa"/>
+          </w:tcPr>
+          <w:p>
+            <w:pPr>
+              <w:pStyle w:val="NoSpacing"/>
+              <w:rPr>
+                <w:szCs w:val="24"/>
+              </w:rPr>
+            </w:pPr>
+            <w:r>
+              <w:rPr>
+                <w:szCs w:val="24"/>
+              </w:rPr>
+              <w:t>15</w:t>
+            </w:r>
+            <w:r>
+              <w:rPr>
+                <w:szCs w:val="24"/>
+              </w:rPr>
+              <w:t>%</w:t>
+            </w:r>
+          </w:p>
+        </w:tc>
+      </w:tr>
+    </w:tbl>
+    <w:p>
+      <w:pPr>
+        <w:pStyle w:val="NoSpacing"/>
+        <w:numPr>
+          <w:ilvl w:val="0"/>
+          <w:numId w:val="16"/>
+        </w:numPr>
+        <w:rPr>
+          <w:b/>
+          <w:szCs w:val="24"/>
+        </w:rPr>
+      </w:pPr>
+      <w:r>
+        <w:rPr>
+          <w:szCs w:val="24"/>
+        </w:rPr>
+        <w:t>%</w:t>
+      </w:r>
+      <w:r>
+        <w:rPr>
+          <w:szCs w:val="24"/>
+        </w:rPr>
+        <w:t xml:space="preserve"> hoàn thành</w:t>
+      </w:r>
+      <w:r>
+        <w:rPr>
+          <w:szCs w:val="24"/>
+        </w:rPr>
+        <w:t xml:space="preserve"> trong tháng 2/2026 </w:t>
+      </w:r>
+      <w:r>
+        <w:rPr>
+          <w:szCs w:val="24"/>
+        </w:rPr>
+        <w:t xml:space="preserve">: (5/10 * 100 + </w:t>
+      </w:r>
+      <w:r>
+        <w:rPr>
+          <w:szCs w:val="24"/>
+        </w:rPr>
+        <w:t>0.5</w:t>
+      </w:r>
+      <w:r>
+        <w:rPr>
+          <w:szCs w:val="24"/>
+        </w:rPr>
+        <w:t>/10*5</w:t>
+      </w:r>
+      <w:r>
+        <w:rPr>
+          <w:szCs w:val="24"/>
+        </w:rPr>
+        <w:t>0</w:t>
+      </w:r>
+      <w:r>
+        <w:rPr>
+          <w:szCs w:val="24"/>
+        </w:rPr>
+        <w:t xml:space="preserve"> </w:t>
+      </w:r>
+      <w:r>
+        <w:rPr>
+          <w:szCs w:val="24"/>
+        </w:rPr>
+        <w:t xml:space="preserve"> +</w:t>
+      </w:r>
+      <w:r>
+        <w:rPr>
+          <w:szCs w:val="24"/>
+        </w:rPr>
+        <w:t xml:space="preserve"> 2.5</w:t>
+      </w:r>
+      <w:r>
+        <w:rPr>
+          <w:szCs w:val="24"/>
+        </w:rPr>
+        <w:t>/10 *</w:t>
+      </w:r>
+      <w:r>
+        <w:rPr>
+          <w:szCs w:val="24"/>
+        </w:rPr>
+        <w:t>1</w:t>
+      </w:r>
+      <w:r>
+        <w:rPr>
+          <w:szCs w:val="24"/>
+        </w:rPr>
+        <w:t>7</w:t>
+      </w:r>
+      <w:r>
+        <w:rPr>
+          <w:szCs w:val="24"/>
+        </w:rPr>
+        <w:t xml:space="preserve"> </w:t>
+      </w:r>
+      <w:r>
+        <w:rPr>
+          <w:szCs w:val="24"/>
+        </w:rPr>
+        <w:t xml:space="preserve"> + </w:t>
+      </w:r>
+      <w:r>
+        <w:rPr>
+          <w:szCs w:val="24"/>
+        </w:rPr>
+        <w:t xml:space="preserve"> 2</w:t>
+      </w:r>
+      <w:r>
+        <w:rPr>
+          <w:szCs w:val="24"/>
+        </w:rPr>
+        <w:t>/10*</w:t>
+      </w:r>
+      <w:r>
+        <w:rPr>
+          <w:szCs w:val="24"/>
+        </w:rPr>
+        <w:t>1</w:t>
+      </w:r>
+      <w:r>
+        <w:rPr>
+          <w:szCs w:val="24"/>
+        </w:rPr>
+        <w:t>5</w:t>
+      </w:r>
+      <w:r>
+        <w:rPr>
+          <w:szCs w:val="24"/>
+        </w:rPr>
+        <w:t xml:space="preserve">)/100 ~ </w:t>
+      </w:r>
+      <w:r>
+        <w:rPr>
+          <w:b/>
+          <w:szCs w:val="24"/>
+        </w:rPr>
+        <w:t>60%</w:t>
       </w:r>
     </w:p>
     <w:p>
@@ -216,20 +950,251 @@
         <w:pStyle w:val="NoSpacing"/>
         <w:ind w:left="720"/>
         <w:rPr>
-          <w:szCs w:val="24"/>
-        </w:rPr>
-      </w:pPr>
-      <w:r>
-        <w:rPr>
-          <w:szCs w:val="24"/>
-        </w:rPr>
-        <w:t>Ngày đánh giá : 0</w:t>
-      </w:r>
-      <w:r>
-        <w:rPr>
-          <w:szCs w:val="24"/>
-        </w:rPr>
-        <w:t>2</w:t>
+          <w:i/>
+          <w:color w:val="7030A0"/>
+          <w:szCs w:val="24"/>
+        </w:rPr>
+      </w:pPr>
+      <w:r>
+        <w:rPr>
+          <w:i/>
+          <w:color w:val="7030A0"/>
+          <w:szCs w:val="24"/>
+        </w:rPr>
+        <w:t>% completed in February 2026: (5/10 * 100 + 0.5/10 * 50 + 2.5/10 * 17 + 2/10 * 15)/100 ~ 60%</w:t>
+      </w:r>
+    </w:p>
+    <w:p>
+      <w:pPr>
+        <w:pStyle w:val="NoSpacing"/>
+        <w:numPr>
+          <w:ilvl w:val="0"/>
+          <w:numId w:val="16"/>
+        </w:numPr>
+        <w:rPr>
+          <w:szCs w:val="24"/>
+        </w:rPr>
+      </w:pPr>
+      <w:r>
+        <w:rPr>
+          <w:szCs w:val="24"/>
+        </w:rPr>
+        <w:t>Số</w:t>
+      </w:r>
+      <w:r>
+        <w:rPr>
+          <w:szCs w:val="24"/>
+        </w:rPr>
+        <w:t xml:space="preserve"> tiền phải thanh toán : 20,000,000 VND /100*60 = 12 ,000,000 VND(Mười hai triệu đồng)</w:t>
+      </w:r>
+    </w:p>
+    <w:p>
+      <w:pPr>
+        <w:pStyle w:val="NoSpacing"/>
+        <w:ind w:left="1080"/>
+        <w:rPr>
+          <w:i/>
+          <w:color w:val="7030A0"/>
+          <w:szCs w:val="24"/>
+        </w:rPr>
+      </w:pPr>
+      <w:r>
+        <w:rPr>
+          <w:i/>
+          <w:color w:val="7030A0"/>
+          <w:szCs w:val="24"/>
+        </w:rPr>
+        <w:t>Amount to be paid: 20,000,000 VND / 100 * 60 = 12,000,000 VND (Twelve million Vietnamese Dong)</w:t>
+      </w:r>
+    </w:p>
+    <w:p>
+      <w:pPr>
+        <w:pStyle w:val="NoSpacing"/>
+        <w:ind w:left="1080"/>
+        <w:rPr>
+          <w:szCs w:val="24"/>
+        </w:rPr>
+      </w:pPr>
+    </w:p>
+    <w:p>
+      <w:pPr>
+        <w:pStyle w:val="NoSpacing"/>
+        <w:ind w:left="720"/>
+        <w:rPr>
+          <w:szCs w:val="24"/>
+        </w:rPr>
+      </w:pPr>
+      <w:r>
+        <w:rPr>
+          <w:szCs w:val="24"/>
+        </w:rPr>
+        <w:t xml:space="preserve">Bên được đánh giá  </w:t>
+      </w:r>
+      <w:r>
+        <w:rPr>
+          <w:szCs w:val="24"/>
+        </w:rPr>
+        <w:tab/>
+      </w:r>
+      <w:r>
+        <w:rPr>
+          <w:szCs w:val="24"/>
+        </w:rPr>
+        <w:tab/>
+        <w:t xml:space="preserve">                                       </w:t>
+      </w:r>
+      <w:r>
+        <w:rPr>
+          <w:szCs w:val="24"/>
+        </w:rPr>
+        <w:t>Người đánh giá</w:t>
+      </w:r>
+    </w:p>
+    <w:p>
+      <w:pPr>
+        <w:pStyle w:val="NoSpacing"/>
+        <w:ind w:left="720"/>
+        <w:rPr>
+          <w:i/>
+          <w:color w:val="7030A0"/>
+          <w:szCs w:val="24"/>
+        </w:rPr>
+      </w:pPr>
+      <w:r>
+        <w:rPr>
+          <w:i/>
+          <w:color w:val="7030A0"/>
+          <w:szCs w:val="24"/>
+        </w:rPr>
+        <w:t>The party being evaluated</w:t>
+      </w:r>
+      <w:r>
+        <w:rPr>
+          <w:i/>
+          <w:color w:val="7030A0"/>
+          <w:szCs w:val="24"/>
+        </w:rPr>
+        <w:tab/>
+      </w:r>
+      <w:r>
+        <w:rPr>
+          <w:i/>
+          <w:color w:val="7030A0"/>
+          <w:szCs w:val="24"/>
+        </w:rPr>
+        <w:tab/>
+      </w:r>
+      <w:r>
+        <w:rPr>
+          <w:i/>
+          <w:color w:val="7030A0"/>
+          <w:szCs w:val="24"/>
+        </w:rPr>
+        <w:tab/>
+        <w:t xml:space="preserve">       Reviewer</w:t>
+      </w:r>
+      <w:r>
+        <w:rPr>
+          <w:i/>
+          <w:color w:val="7030A0"/>
+          <w:szCs w:val="24"/>
+        </w:rPr>
+        <w:tab/>
+      </w:r>
+    </w:p>
+    <w:p>
+      <w:pPr>
+        <w:pStyle w:val="NoSpacing"/>
+        <w:ind w:left="720"/>
+        <w:rPr>
+          <w:i/>
+          <w:color w:val="7030A0"/>
+          <w:szCs w:val="24"/>
+        </w:rPr>
+      </w:pPr>
+    </w:p>
+    <w:p>
+      <w:pPr>
+        <w:pStyle w:val="NoSpacing"/>
+        <w:ind w:left="720"/>
+        <w:rPr>
+          <w:szCs w:val="24"/>
+        </w:rPr>
+      </w:pPr>
+    </w:p>
+    <w:p>
+      <w:pPr>
+        <w:pStyle w:val="NoSpacing"/>
+        <w:ind w:firstLine="720"/>
+        <w:rPr>
+          <w:szCs w:val="24"/>
+        </w:rPr>
+      </w:pPr>
+      <w:r>
+        <w:rPr>
+          <w:szCs w:val="24"/>
+        </w:rPr>
+        <w:t xml:space="preserve">Võ Văn Thuận                                                                            </w:t>
+      </w:r>
+      <w:r>
+        <w:rPr>
+          <w:szCs w:val="24"/>
+        </w:rPr>
+        <w:t>Đặng Quang Hải</w:t>
+      </w:r>
+    </w:p>
+    <w:p>
+      <w:pPr>
+        <w:pStyle w:val="NoSpacing"/>
+        <w:ind w:left="2880" w:firstLine="720"/>
+        <w:rPr>
+          <w:szCs w:val="24"/>
+        </w:rPr>
+      </w:pPr>
+      <w:r>
+        <w:rPr>
+          <w:szCs w:val="24"/>
+        </w:rPr>
+        <w:t xml:space="preserve">                                       </w:t>
+      </w:r>
+      <w:r>
+        <w:rPr>
+          <w:szCs w:val="24"/>
+        </w:rPr>
+        <w:t>Ngày đánh giá</w:t>
+      </w:r>
+      <w:r>
+        <w:rPr>
+          <w:szCs w:val="24"/>
+        </w:rPr>
+        <w:t>/</w:t>
+      </w:r>
+      <w:r>
+        <w:rPr>
+          <w:i/>
+          <w:color w:val="7030A0"/>
+          <w:szCs w:val="24"/>
+        </w:rPr>
+        <w:t>Review Date</w:t>
+      </w:r>
+      <w:r>
+        <w:rPr>
+          <w:color w:val="7030A0"/>
+          <w:szCs w:val="24"/>
+        </w:rPr>
+        <w:t xml:space="preserve"> </w:t>
+      </w:r>
+      <w:r>
+        <w:rPr>
+          <w:szCs w:val="24"/>
+        </w:rPr>
+        <w:t>: 0</w:t>
+      </w:r>
+      <w:r>
+        <w:rPr>
+          <w:szCs w:val="24"/>
+        </w:rPr>
+        <w:t>5</w:t>
       </w:r>
       <w:r>
         <w:rPr>
@@ -246,7 +1211,7 @@
       <w:headerReference w:type="first" r:id="rId13"/>
       <w:footerReference w:type="first" r:id="rId14"/>
       <w:pgSz w:w="12240" w:h="15840"/>
-      <w:pgMar w:top="1440" w:right="1440" w:bottom="1440" w:left="1440" w:header="720" w:footer="720" w:gutter="0"/>
+      <w:pgMar w:top="1418" w:right="1440" w:bottom="1440" w:left="1440" w:header="720" w:footer="720" w:gutter="0"/>
       <w:cols w:space="720"/>
     </w:sectPr>
   </w:body>
@@ -1892,6 +2857,233 @@
       </w:pPr>
     </w:lvl>
   </w:abstractNum>
+  <w:abstractNum w:abstractNumId="14" w15:restartNumberingAfterBreak="0">
+    <w:nsid w:val="789C446A"/>
+    <w:multiLevelType w:val="hybridMultilevel"/>
+    <w:tmpl w:val="FC32A2BA"/>
+    <w:lvl w:ilvl="0" w:tplc="3266DD8C">
+      <w:start w:val="2"/>
+      <w:numFmt w:val="bullet"/>
+      <w:lvlText w:val=""/>
+      <w:lvlJc w:val="left"/>
+      <w:pPr>
+        <w:ind w:left="1080" w:hanging="360"/>
+      </w:pPr>
+      <w:rPr>
+        <w:rFonts w:ascii="Wingdings" w:eastAsiaTheme="minorEastAsia" w:hAnsi="Wingdings" w:cstheme="minorBidi" w:hint="default"/>
+        <w:b w:val="0"/>
+      </w:rPr>
+    </w:lvl>
+    <w:lvl w:ilvl="1" w:tplc="04090003" w:tentative="1">
+      <w:start w:val="1"/>
+      <w:numFmt w:val="bullet"/>
+      <w:lvlText w:val="o"/>
+      <w:lvlJc w:val="left"/>
+      <w:pPr>
+        <w:ind w:left="1800" w:hanging="360"/>
+      </w:pPr>
+      <w:rPr>
+        <w:rFonts w:ascii="Courier New" w:hAnsi="Courier New" w:cs="Courier New" w:hint="default"/>
+      </w:rPr>
+    </w:lvl>
+    <w:lvl w:ilvl="2" w:tplc="04090005" w:tentative="1">
+      <w:start w:val="1"/>
+      <w:numFmt w:val="bullet"/>
+      <w:lvlText w:val=""/>
+      <w:lvlJc w:val="left"/>
+      <w:pPr>
+        <w:ind w:left="2520" w:hanging="360"/>
+      </w:pPr>
+      <w:rPr>
+        <w:rFonts w:ascii="Wingdings" w:hAnsi="Wingdings" w:hint="default"/>
+      </w:rPr>
+    </w:lvl>
+    <w:lvl w:ilvl="3" w:tplc="04090001" w:tentative="1">
+      <w:start w:val="1"/>
+      <w:numFmt w:val="bullet"/>
+      <w:lvlText w:val=""/>
+      <w:lvlJc w:val="left"/>
+      <w:pPr>
+        <w:ind w:left="3240" w:hanging="360"/>
+      </w:pPr>
+      <w:rPr>
+        <w:rFonts w:ascii="Symbol" w:hAnsi="Symbol" w:hint="default"/>
+      </w:rPr>
+    </w:lvl>
+    <w:lvl w:ilvl="4" w:tplc="04090003" w:tentative="1">
+      <w:start w:val="1"/>
+      <w:numFmt w:val="bullet"/>
+      <w:lvlText w:val="o"/>
+      <w:lvlJc w:val="left"/>
+      <w:pPr>
+        <w:ind w:left="3960" w:hanging="360"/>
+      </w:pPr>
+      <w:rPr>
+        <w:rFonts w:ascii="Courier New" w:hAnsi="Courier New" w:cs="Courier New" w:hint="default"/>
+      </w:rPr>
+    </w:lvl>
+    <w:lvl w:ilvl="5" w:tplc="04090005" w:tentative="1">
+      <w:start w:val="1"/>
+      <w:numFmt w:val="bullet"/>
+      <w:lvlText w:val=""/>
+      <w:lvlJc w:val="left"/>
+      <w:pPr>
+        <w:ind w:left="4680" w:hanging="360"/>
+      </w:pPr>
+      <w:rPr>
+        <w:rFonts w:ascii="Wingdings" w:hAnsi="Wingdings" w:hint="default"/>
+      </w:rPr>
+    </w:lvl>
+    <w:lvl w:ilvl="6" w:tplc="04090001" w:tentative="1">
+      <w:start w:val="1"/>
+      <w:numFmt w:val="bullet"/>
+      <w:lvlText w:val=""/>
+      <w:lvlJc w:val="left"/>
+      <w:pPr>
+        <w:ind w:left="5400" w:hanging="360"/>
+      </w:pPr>
+      <w:rPr>
+        <w:rFonts w:ascii="Symbol" w:hAnsi="Symbol" w:hint="default"/>
+      </w:rPr>
+    </w:lvl>
+    <w:lvl w:ilvl="7" w:tplc="04090003" w:tentative="1">
+      <w:start w:val="1"/>
+      <w:numFmt w:val="bullet"/>
+      <w:lvlText w:val="o"/>
+      <w:lvlJc w:val="left"/>
+      <w:pPr>
+        <w:ind w:left="6120" w:hanging="360"/>
+      </w:pPr>
+      <w:rPr>
+        <w:rFonts w:ascii="Courier New" w:hAnsi="Courier New" w:cs="Courier New" w:hint="default"/>
+      </w:rPr>
+    </w:lvl>
+    <w:lvl w:ilvl="8" w:tplc="04090005" w:tentative="1">
+      <w:start w:val="1"/>
+      <w:numFmt w:val="bullet"/>
+      <w:lvlText w:val=""/>
+      <w:lvlJc w:val="left"/>
+      <w:pPr>
+        <w:ind w:left="6840" w:hanging="360"/>
+      </w:pPr>
+      <w:rPr>
+        <w:rFonts w:ascii="Wingdings" w:hAnsi="Wingdings" w:hint="default"/>
+      </w:rPr>
+    </w:lvl>
+  </w:abstractNum>
+  <w:abstractNum w:abstractNumId="15" w15:restartNumberingAfterBreak="0">
+    <w:nsid w:val="7C2F6564"/>
+    <w:multiLevelType w:val="hybridMultilevel"/>
+    <w:tmpl w:val="99EA4992"/>
+    <w:lvl w:ilvl="0" w:tplc="5BCAD302">
+      <w:start w:val="2"/>
+      <w:numFmt w:val="bullet"/>
+      <w:lvlText w:val="-"/>
+      <w:lvlJc w:val="left"/>
+      <w:pPr>
+        <w:ind w:left="1080" w:hanging="360"/>
+      </w:pPr>
+      <w:rPr>
+        <w:rFonts w:ascii="Corbel" w:eastAsiaTheme="minorEastAsia" w:hAnsi="Corbel" w:cstheme="minorBidi" w:hint="default"/>
+      </w:rPr>
+    </w:lvl>
+    <w:lvl w:ilvl="1" w:tplc="04090003" w:tentative="1">
+      <w:start w:val="1"/>
+      <w:numFmt w:val="bullet"/>
+      <w:lvlText w:val="o"/>
+      <w:lvlJc w:val="left"/>
+      <w:pPr>
+        <w:ind w:left="1800" w:hanging="360"/>
+      </w:pPr>
+      <w:rPr>
+        <w:rFonts w:ascii="Courier New" w:hAnsi="Courier New" w:cs="Courier New" w:hint="default"/>
+      </w:rPr>
+    </w:lvl>
+    <w:lvl w:ilvl="2" w:tplc="04090005" w:tentative="1">
+      <w:start w:val="1"/>
+      <w:numFmt w:val="bullet"/>
+      <w:lvlText w:val=""/>
+      <w:lvlJc w:val="left"/>
+      <w:pPr>
+        <w:ind w:left="2520" w:hanging="360"/>
+      </w:pPr>
+      <w:rPr>
+        <w:rFonts w:ascii="Wingdings" w:hAnsi="Wingdings" w:hint="default"/>
+      </w:rPr>
+    </w:lvl>
+    <w:lvl w:ilvl="3" w:tplc="04090001" w:tentative="1">
+      <w:start w:val="1"/>
+      <w:numFmt w:val="bullet"/>
+      <w:lvlText w:val=""/>
+      <w:lvlJc w:val="left"/>
+      <w:pPr>
+        <w:ind w:left="3240" w:hanging="360"/>
+      </w:pPr>
+      <w:rPr>
+        <w:rFonts w:ascii="Symbol" w:hAnsi="Symbol" w:hint="default"/>
+      </w:rPr>
+    </w:lvl>
+    <w:lvl w:ilvl="4" w:tplc="04090003" w:tentative="1">
+      <w:start w:val="1"/>
+      <w:numFmt w:val="bullet"/>
+      <w:lvlText w:val="o"/>
+      <w:lvlJc w:val="left"/>
+      <w:pPr>
+        <w:ind w:left="3960" w:hanging="360"/>
+      </w:pPr>
+      <w:rPr>
+        <w:rFonts w:ascii="Courier New" w:hAnsi="Courier New" w:cs="Courier New" w:hint="default"/>
+      </w:rPr>
+    </w:lvl>
+    <w:lvl w:ilvl="5" w:tplc="04090005" w:tentative="1">
+      <w:start w:val="1"/>
+      <w:numFmt w:val="bullet"/>
+      <w:lvlText w:val=""/>
+      <w:lvlJc w:val="left"/>
+      <w:pPr>
+        <w:ind w:left="4680" w:hanging="360"/>
+      </w:pPr>
+      <w:rPr>
+        <w:rFonts w:ascii="Wingdings" w:hAnsi="Wingdings" w:hint="default"/>
+      </w:rPr>
+    </w:lvl>
+    <w:lvl w:ilvl="6" w:tplc="04090001" w:tentative="1">
+      <w:start w:val="1"/>
+      <w:numFmt w:val="bullet"/>
+      <w:lvlText w:val=""/>
+      <w:lvlJc w:val="left"/>
+      <w:pPr>
+        <w:ind w:left="5400" w:hanging="360"/>
+      </w:pPr>
+      <w:rPr>
+        <w:rFonts w:ascii="Symbol" w:hAnsi="Symbol" w:hint="default"/>
+      </w:rPr>
+    </w:lvl>
+    <w:lvl w:ilvl="7" w:tplc="04090003" w:tentative="1">
+      <w:start w:val="1"/>
+      <w:numFmt w:val="bullet"/>
+      <w:lvlText w:val="o"/>
+      <w:lvlJc w:val="left"/>
+      <w:pPr>
+        <w:ind w:left="6120" w:hanging="360"/>
+      </w:pPr>
+      <w:rPr>
+        <w:rFonts w:ascii="Courier New" w:hAnsi="Courier New" w:cs="Courier New" w:hint="default"/>
+      </w:rPr>
+    </w:lvl>
+    <w:lvl w:ilvl="8" w:tplc="04090005" w:tentative="1">
+      <w:start w:val="1"/>
+      <w:numFmt w:val="bullet"/>
+      <w:lvlText w:val=""/>
+      <w:lvlJc w:val="left"/>
+      <w:pPr>
+        <w:ind w:left="6840" w:hanging="360"/>
+      </w:pPr>
+      <w:rPr>
+        <w:rFonts w:ascii="Wingdings" w:hAnsi="Wingdings" w:hint="default"/>
+      </w:rPr>
+    </w:lvl>
+  </w:abstractNum>
   <w:num w:numId="1">
     <w:abstractNumId w:val="0"/>
   </w:num>
@@ -1933,6 +3125,12 @@
   </w:num>
   <w:num w:numId="14">
     <w:abstractNumId w:val="13"/>
+  </w:num>
+  <w:num w:numId="15">
+    <w:abstractNumId w:val="15"/>
+  </w:num>
+  <w:num w:numId="16">
+    <w:abstractNumId w:val="14"/>
   </w:num>
   <w:numIdMacAtCleanup w:val="5"/>
 </w:numbering>
@@ -3838,7 +5036,7 @@
 </file>
 
 <file path=customXml/itemProps2.xml><?xml version="1.0" encoding="utf-8"?>
-<ds:datastoreItem xmlns:ds="http://schemas.openxmlformats.org/officeDocument/2006/customXml" ds:itemID="{79B37A05-0294-44C4-BBE7-AD4AB6AD5F2E}">
+<ds:datastoreItem xmlns:ds="http://schemas.openxmlformats.org/officeDocument/2006/customXml" ds:itemID="{6B001C30-532D-4F48-BF39-86D3D091B4CD}">
   <ds:schemaRefs>
     <ds:schemaRef ds:uri="http://schemas.openxmlformats.org/officeDocument/2006/bibliography"/>
   </ds:schemaRefs>

</xml_diff>